<commit_message>
Definir el sistema de diseño y organizar los prototipos (HU-03)
Incorpora la identidad visual derivada del logo de AEUVG y los
prototipos de las pantallas principales.

- Paleta con el violeta como color de acción y los tonos del logo
  como acentos, sobre neutros cálidos; definida como variables de
  Tailwind en globals.css y documentada en docs/diseno
- Plus Jakarta Sans como familia tipográfica del proyecto
- Logo oficial incorporado en public/ y aplicado en los prototipos
- Prototipos de 23 pantallas, en versión de escritorio y móvil,
  con su marcado de referencia recoloreado a la paleta definitiva
- Documento del Sprint 1 actualizado con la sección de HU-03
</commit_message>
<xml_diff>
--- a/Documentos/AEUVG - Desarrollo Sprint 1.docx
+++ b/Documentos/AEUVG - Desarrollo Sprint 1.docx
@@ -1870,7 +1870,7 @@
           <w:sz w:val="34"/>
           <w:szCs w:val="34"/>
         </w:rPr>
-        <w:t xml:space="preserve">4. Estado del sprint</w:t>
+        <w:t xml:space="preserve">4. HU-03 - Sistema de diseño y prototipos de las pantallas principales</w:t>
       </w:r>
     </w:p>
     <w:p>
@@ -1884,7 +1884,638 @@
           <w:sz w:val="24"/>
           <w:szCs w:val="24"/>
         </w:rPr>
-        <w:t xml:space="preserve">Al momento de esta actualización, las historias de usuario HU-01 y HU-02 se encuentran completadas. El sistema cuenta con:</w:t>
+        <w:t xml:space="preserve">Esta historia define la identidad visual de la plataforma y los prototipos de sus pantallas principales, de manera que el desarrollo de las interfaces sea consistente durante todo el proyecto y no deba rediseñarse en cada sprint. Al momento de esta actualización se encuentran definidos el sistema de diseño y los prototipos; la implementación de la biblioteca de componentes y la presentación a AEUVG continúan en curso.</w:t>
+      </w:r>
+    </w:p>
+    <w:p>
+      <w:pPr>
+        <w:pStyle w:val="Heading2"/>
+        <w:spacing w:after="160" w:before="280"/>
+      </w:pPr>
+      <w:r>
+        <w:rPr>
+          <w:rFonts w:ascii="Times New Roman" w:cs="Times New Roman" w:eastAsia="Times New Roman" w:hAnsi="Times New Roman"/>
+          <w:b/>
+          <w:bCs/>
+          <w:color w:val="000000"/>
+          <w:sz w:val="30"/>
+          <w:szCs w:val="30"/>
+        </w:rPr>
+        <w:t xml:space="preserve">4.1. Identidad visual y paleta</w:t>
+      </w:r>
+    </w:p>
+    <w:p>
+      <w:pPr>
+        <w:spacing w:after="160" w:line="300"/>
+        <w:jc w:val="both"/>
+      </w:pPr>
+      <w:r>
+        <w:rPr>
+          <w:rFonts w:ascii="Times New Roman" w:cs="Times New Roman" w:eastAsia="Times New Roman" w:hAnsi="Times New Roman"/>
+          <w:sz w:val="24"/>
+          <w:szCs w:val="24"/>
+        </w:rPr>
+        <w:t xml:space="preserve">La paleta se derivó del logo de AEUVG, que representa figuras humanas de colores distintos formando un círculo, en alusión a la unión de las asociaciones estudiantiles. Dado que ningún color del logo predomina sobre los demás, se optó por tomar el violeta como color de acción, por ser el que mejor se identifica como elemento interactivo, y repartir los tonos restantes como acentos a lo largo de la interfaz.</w:t>
+      </w:r>
+    </w:p>
+    <w:p>
+      <w:pPr>
+        <w:spacing w:after="160"/>
+      </w:pPr>
+    </w:p>
+    <w:tbl>
+      <w:tblPr>
+        <w:tblW w:type="dxa" w:w="9360"/>
+        <w:tblBorders>
+          <w:top w:val="single" w:color="auto" w:sz="4"/>
+          <w:left w:val="single" w:color="auto" w:sz="4"/>
+          <w:bottom w:val="single" w:color="auto" w:sz="4"/>
+          <w:right w:val="single" w:color="auto" w:sz="4"/>
+          <w:insideH w:val="single" w:color="auto" w:sz="4"/>
+          <w:insideV w:val="single" w:color="auto" w:sz="4"/>
+        </w:tblBorders>
+      </w:tblPr>
+      <w:tblGrid>
+        <w:gridCol w:w="2600"/>
+        <w:gridCol w:w="2000"/>
+        <w:gridCol w:w="4760"/>
+      </w:tblGrid>
+      <w:tr>
+        <w:trPr>
+          <w:tblHeader/>
+        </w:trPr>
+        <w:tc>
+          <w:tcPr>
+            <w:tcW w:type="dxa" w:w="2600"/>
+            <w:shd w:fill="E7E6E6" w:val="clear"/>
+            <w:tcMar>
+              <w:top w:type="dxa" w:w="80"/>
+              <w:left w:type="dxa" w:w="120"/>
+              <w:bottom w:type="dxa" w:w="80"/>
+              <w:right w:type="dxa" w:w="120"/>
+            </w:tcMar>
+          </w:tcPr>
+          <w:p>
+            <w:pPr>
+              <w:spacing w:after="0"/>
+            </w:pPr>
+            <w:r>
+              <w:rPr>
+                <w:rFonts w:ascii="Times New Roman" w:cs="Times New Roman" w:eastAsia="Times New Roman" w:hAnsi="Times New Roman"/>
+                <w:b/>
+                <w:bCs/>
+                <w:sz w:val="24"/>
+                <w:szCs w:val="24"/>
+              </w:rPr>
+              <w:t xml:space="preserve">Grupo</w:t>
+            </w:r>
+          </w:p>
+        </w:tc>
+        <w:tc>
+          <w:tcPr>
+            <w:tcW w:type="dxa" w:w="2000"/>
+            <w:shd w:fill="E7E6E6" w:val="clear"/>
+            <w:tcMar>
+              <w:top w:type="dxa" w:w="80"/>
+              <w:left w:type="dxa" w:w="120"/>
+              <w:bottom w:type="dxa" w:w="80"/>
+              <w:right w:type="dxa" w:w="120"/>
+            </w:tcMar>
+          </w:tcPr>
+          <w:p>
+            <w:pPr>
+              <w:spacing w:after="0"/>
+            </w:pPr>
+            <w:r>
+              <w:rPr>
+                <w:rFonts w:ascii="Times New Roman" w:cs="Times New Roman" w:eastAsia="Times New Roman" w:hAnsi="Times New Roman"/>
+                <w:b/>
+                <w:bCs/>
+                <w:sz w:val="24"/>
+                <w:szCs w:val="24"/>
+              </w:rPr>
+              <w:t xml:space="preserve">Color</w:t>
+            </w:r>
+          </w:p>
+        </w:tc>
+        <w:tc>
+          <w:tcPr>
+            <w:tcW w:type="dxa" w:w="4760"/>
+            <w:shd w:fill="E7E6E6" w:val="clear"/>
+            <w:tcMar>
+              <w:top w:type="dxa" w:w="80"/>
+              <w:left w:type="dxa" w:w="120"/>
+              <w:bottom w:type="dxa" w:w="80"/>
+              <w:right w:type="dxa" w:w="120"/>
+            </w:tcMar>
+          </w:tcPr>
+          <w:p>
+            <w:pPr>
+              <w:spacing w:after="0"/>
+            </w:pPr>
+            <w:r>
+              <w:rPr>
+                <w:rFonts w:ascii="Times New Roman" w:cs="Times New Roman" w:eastAsia="Times New Roman" w:hAnsi="Times New Roman"/>
+                <w:b/>
+                <w:bCs/>
+                <w:sz w:val="24"/>
+                <w:szCs w:val="24"/>
+              </w:rPr>
+              <w:t xml:space="preserve">Uso</w:t>
+            </w:r>
+          </w:p>
+        </w:tc>
+      </w:tr>
+      <w:tr>
+        <w:tc>
+          <w:tcPr>
+            <w:tcW w:type="dxa" w:w="2600"/>
+            <w:tcMar>
+              <w:top w:type="dxa" w:w="80"/>
+              <w:left w:type="dxa" w:w="120"/>
+              <w:bottom w:type="dxa" w:w="80"/>
+              <w:right w:type="dxa" w:w="120"/>
+            </w:tcMar>
+          </w:tcPr>
+          <w:p>
+            <w:pPr>
+              <w:spacing w:after="0"/>
+            </w:pPr>
+            <w:r>
+              <w:rPr>
+                <w:rFonts w:ascii="Times New Roman" w:cs="Times New Roman" w:eastAsia="Times New Roman" w:hAnsi="Times New Roman"/>
+                <w:b w:val="false"/>
+                <w:bCs w:val="false"/>
+                <w:sz w:val="24"/>
+                <w:szCs w:val="24"/>
+              </w:rPr>
+              <w:t xml:space="preserve">Acción</w:t>
+            </w:r>
+          </w:p>
+        </w:tc>
+        <w:tc>
+          <w:tcPr>
+            <w:tcW w:type="dxa" w:w="2000"/>
+            <w:tcMar>
+              <w:top w:type="dxa" w:w="80"/>
+              <w:left w:type="dxa" w:w="120"/>
+              <w:bottom w:type="dxa" w:w="80"/>
+              <w:right w:type="dxa" w:w="120"/>
+            </w:tcMar>
+          </w:tcPr>
+          <w:p>
+            <w:pPr>
+              <w:spacing w:after="0"/>
+            </w:pPr>
+            <w:r>
+              <w:rPr>
+                <w:rFonts w:ascii="Times New Roman" w:cs="Times New Roman" w:eastAsia="Times New Roman" w:hAnsi="Times New Roman"/>
+                <w:b w:val="false"/>
+                <w:bCs w:val="false"/>
+                <w:sz w:val="24"/>
+                <w:szCs w:val="24"/>
+              </w:rPr>
+              <w:t xml:space="preserve">Violeta #6D4AFF</w:t>
+            </w:r>
+          </w:p>
+        </w:tc>
+        <w:tc>
+          <w:tcPr>
+            <w:tcW w:type="dxa" w:w="4760"/>
+            <w:tcMar>
+              <w:top w:type="dxa" w:w="80"/>
+              <w:left w:type="dxa" w:w="120"/>
+              <w:bottom w:type="dxa" w:w="80"/>
+              <w:right w:type="dxa" w:w="120"/>
+            </w:tcMar>
+          </w:tcPr>
+          <w:p>
+            <w:pPr>
+              <w:spacing w:after="0"/>
+            </w:pPr>
+            <w:r>
+              <w:rPr>
+                <w:rFonts w:ascii="Times New Roman" w:cs="Times New Roman" w:eastAsia="Times New Roman" w:hAnsi="Times New Roman"/>
+                <w:b w:val="false"/>
+                <w:bCs w:val="false"/>
+                <w:sz w:val="24"/>
+                <w:szCs w:val="24"/>
+              </w:rPr>
+              <w:t xml:space="preserve">Botones principales, enlaces y navegación.</w:t>
+            </w:r>
+          </w:p>
+        </w:tc>
+      </w:tr>
+      <w:tr>
+        <w:tc>
+          <w:tcPr>
+            <w:tcW w:type="dxa" w:w="2600"/>
+            <w:tcMar>
+              <w:top w:type="dxa" w:w="80"/>
+              <w:left w:type="dxa" w:w="120"/>
+              <w:bottom w:type="dxa" w:w="80"/>
+              <w:right w:type="dxa" w:w="120"/>
+            </w:tcMar>
+          </w:tcPr>
+          <w:p>
+            <w:pPr>
+              <w:spacing w:after="0"/>
+            </w:pPr>
+            <w:r>
+              <w:rPr>
+                <w:rFonts w:ascii="Times New Roman" w:cs="Times New Roman" w:eastAsia="Times New Roman" w:hAnsi="Times New Roman"/>
+                <w:b w:val="false"/>
+                <w:bCs w:val="false"/>
+                <w:sz w:val="24"/>
+                <w:szCs w:val="24"/>
+              </w:rPr>
+              <w:t xml:space="preserve">Acentos</w:t>
+            </w:r>
+          </w:p>
+        </w:tc>
+        <w:tc>
+          <w:tcPr>
+            <w:tcW w:type="dxa" w:w="2000"/>
+            <w:tcMar>
+              <w:top w:type="dxa" w:w="80"/>
+              <w:left w:type="dxa" w:w="120"/>
+              <w:bottom w:type="dxa" w:w="80"/>
+              <w:right w:type="dxa" w:w="120"/>
+            </w:tcMar>
+          </w:tcPr>
+          <w:p>
+            <w:pPr>
+              <w:spacing w:after="0"/>
+            </w:pPr>
+            <w:r>
+              <w:rPr>
+                <w:rFonts w:ascii="Times New Roman" w:cs="Times New Roman" w:eastAsia="Times New Roman" w:hAnsi="Times New Roman"/>
+                <w:b w:val="false"/>
+                <w:bCs w:val="false"/>
+                <w:sz w:val="24"/>
+                <w:szCs w:val="24"/>
+              </w:rPr>
+              <w:t xml:space="preserve">Coral, turquesa, ámbar, magenta, lima, cielo y lavanda</w:t>
+            </w:r>
+          </w:p>
+        </w:tc>
+        <w:tc>
+          <w:tcPr>
+            <w:tcW w:type="dxa" w:w="4760"/>
+            <w:tcMar>
+              <w:top w:type="dxa" w:w="80"/>
+              <w:left w:type="dxa" w:w="120"/>
+              <w:bottom w:type="dxa" w:w="80"/>
+              <w:right w:type="dxa" w:w="120"/>
+            </w:tcMar>
+          </w:tcPr>
+          <w:p>
+            <w:pPr>
+              <w:spacing w:after="0"/>
+            </w:pPr>
+            <w:r>
+              <w:rPr>
+                <w:rFonts w:ascii="Times New Roman" w:cs="Times New Roman" w:eastAsia="Times New Roman" w:hAnsi="Times New Roman"/>
+                <w:b w:val="false"/>
+                <w:bCs w:val="false"/>
+                <w:sz w:val="24"/>
+                <w:szCs w:val="24"/>
+              </w:rPr>
+              <w:t xml:space="preserve">Diferenciación de las categorías de eventos y realces de sección.</w:t>
+            </w:r>
+          </w:p>
+        </w:tc>
+      </w:tr>
+      <w:tr>
+        <w:tc>
+          <w:tcPr>
+            <w:tcW w:type="dxa" w:w="2600"/>
+            <w:tcMar>
+              <w:top w:type="dxa" w:w="80"/>
+              <w:left w:type="dxa" w:w="120"/>
+              <w:bottom w:type="dxa" w:w="80"/>
+              <w:right w:type="dxa" w:w="120"/>
+            </w:tcMar>
+          </w:tcPr>
+          <w:p>
+            <w:pPr>
+              <w:spacing w:after="0"/>
+            </w:pPr>
+            <w:r>
+              <w:rPr>
+                <w:rFonts w:ascii="Times New Roman" w:cs="Times New Roman" w:eastAsia="Times New Roman" w:hAnsi="Times New Roman"/>
+                <w:b w:val="false"/>
+                <w:bCs w:val="false"/>
+                <w:sz w:val="24"/>
+                <w:szCs w:val="24"/>
+              </w:rPr>
+              <w:t xml:space="preserve">Neutros</w:t>
+            </w:r>
+          </w:p>
+        </w:tc>
+        <w:tc>
+          <w:tcPr>
+            <w:tcW w:type="dxa" w:w="2000"/>
+            <w:tcMar>
+              <w:top w:type="dxa" w:w="80"/>
+              <w:left w:type="dxa" w:w="120"/>
+              <w:bottom w:type="dxa" w:w="80"/>
+              <w:right w:type="dxa" w:w="120"/>
+            </w:tcMar>
+          </w:tcPr>
+          <w:p>
+            <w:pPr>
+              <w:spacing w:after="0"/>
+            </w:pPr>
+            <w:r>
+              <w:rPr>
+                <w:rFonts w:ascii="Times New Roman" w:cs="Times New Roman" w:eastAsia="Times New Roman" w:hAnsi="Times New Roman"/>
+                <w:b w:val="false"/>
+                <w:bCs w:val="false"/>
+                <w:sz w:val="24"/>
+                <w:szCs w:val="24"/>
+              </w:rPr>
+              <w:t xml:space="preserve">Fondo crema #FFF8F3 y texto #1C162B</w:t>
+            </w:r>
+          </w:p>
+        </w:tc>
+        <w:tc>
+          <w:tcPr>
+            <w:tcW w:type="dxa" w:w="4760"/>
+            <w:tcMar>
+              <w:top w:type="dxa" w:w="80"/>
+              <w:left w:type="dxa" w:w="120"/>
+              <w:bottom w:type="dxa" w:w="80"/>
+              <w:right w:type="dxa" w:w="120"/>
+            </w:tcMar>
+          </w:tcPr>
+          <w:p>
+            <w:pPr>
+              <w:spacing w:after="0"/>
+            </w:pPr>
+            <w:r>
+              <w:rPr>
+                <w:rFonts w:ascii="Times New Roman" w:cs="Times New Roman" w:eastAsia="Times New Roman" w:hAnsi="Times New Roman"/>
+                <w:b w:val="false"/>
+                <w:bCs w:val="false"/>
+                <w:sz w:val="24"/>
+                <w:szCs w:val="24"/>
+              </w:rPr>
+              <w:t xml:space="preserve">Fondos y texto. Se eligieron neutros cálidos en lugar de grises para que la interfaz no resulte fría.</w:t>
+            </w:r>
+          </w:p>
+        </w:tc>
+      </w:tr>
+      <w:tr>
+        <w:tc>
+          <w:tcPr>
+            <w:tcW w:type="dxa" w:w="2600"/>
+            <w:tcMar>
+              <w:top w:type="dxa" w:w="80"/>
+              <w:left w:type="dxa" w:w="120"/>
+              <w:bottom w:type="dxa" w:w="80"/>
+              <w:right w:type="dxa" w:w="120"/>
+            </w:tcMar>
+          </w:tcPr>
+          <w:p>
+            <w:pPr>
+              <w:spacing w:after="0"/>
+            </w:pPr>
+            <w:r>
+              <w:rPr>
+                <w:rFonts w:ascii="Times New Roman" w:cs="Times New Roman" w:eastAsia="Times New Roman" w:hAnsi="Times New Roman"/>
+                <w:b w:val="false"/>
+                <w:bCs w:val="false"/>
+                <w:sz w:val="24"/>
+                <w:szCs w:val="24"/>
+              </w:rPr>
+              <w:t xml:space="preserve">Estados</w:t>
+            </w:r>
+          </w:p>
+        </w:tc>
+        <w:tc>
+          <w:tcPr>
+            <w:tcW w:type="dxa" w:w="2000"/>
+            <w:tcMar>
+              <w:top w:type="dxa" w:w="80"/>
+              <w:left w:type="dxa" w:w="120"/>
+              <w:bottom w:type="dxa" w:w="80"/>
+              <w:right w:type="dxa" w:w="120"/>
+            </w:tcMar>
+          </w:tcPr>
+          <w:p>
+            <w:pPr>
+              <w:spacing w:after="0"/>
+            </w:pPr>
+            <w:r>
+              <w:rPr>
+                <w:rFonts w:ascii="Times New Roman" w:cs="Times New Roman" w:eastAsia="Times New Roman" w:hAnsi="Times New Roman"/>
+                <w:b w:val="false"/>
+                <w:bCs w:val="false"/>
+                <w:sz w:val="24"/>
+                <w:szCs w:val="24"/>
+              </w:rPr>
+              <w:t xml:space="preserve">Éxito, advertencia, error e informativo</w:t>
+            </w:r>
+          </w:p>
+        </w:tc>
+        <w:tc>
+          <w:tcPr>
+            <w:tcW w:type="dxa" w:w="4760"/>
+            <w:tcMar>
+              <w:top w:type="dxa" w:w="80"/>
+              <w:left w:type="dxa" w:w="120"/>
+              <w:bottom w:type="dxa" w:w="80"/>
+              <w:right w:type="dxa" w:w="120"/>
+            </w:tcMar>
+          </w:tcPr>
+          <w:p>
+            <w:pPr>
+              <w:spacing w:after="0"/>
+            </w:pPr>
+            <w:r>
+              <w:rPr>
+                <w:rFonts w:ascii="Times New Roman" w:cs="Times New Roman" w:eastAsia="Times New Roman" w:hAnsi="Times New Roman"/>
+                <w:b w:val="false"/>
+                <w:bCs w:val="false"/>
+                <w:sz w:val="24"/>
+                <w:szCs w:val="24"/>
+              </w:rPr>
+              <w:t xml:space="preserve">Las horas beca acreditadas se muestran en turquesa y las pendientes en ámbar.</w:t>
+            </w:r>
+          </w:p>
+        </w:tc>
+      </w:tr>
+    </w:tbl>
+    <w:p>
+      <w:pPr>
+        <w:spacing w:after="160"/>
+      </w:pPr>
+    </w:p>
+    <w:p>
+      <w:pPr>
+        <w:spacing w:after="160" w:line="300"/>
+        <w:jc w:val="both"/>
+      </w:pPr>
+      <w:r>
+        <w:rPr>
+          <w:rFonts w:ascii="Times New Roman" w:cs="Times New Roman" w:eastAsia="Times New Roman" w:hAnsi="Times New Roman"/>
+          <w:sz w:val="24"/>
+          <w:szCs w:val="24"/>
+        </w:rPr>
+        <w:t xml:space="preserve">Cada una de las ocho categorías de eventos cargadas durante la historia anterior tiene asignado uno de los colores de acento, almacenado en la propia base de datos. La paleta completa quedó documentada en el archivo docs/diseno/sistema-diseno.md e implementada como variables de diseño dentro del proyecto, de modo que las pantallas la consumen desde un único lugar.</w:t>
+      </w:r>
+    </w:p>
+    <w:p>
+      <w:pPr>
+        <w:pStyle w:val="Heading2"/>
+        <w:spacing w:after="160" w:before="280"/>
+      </w:pPr>
+      <w:r>
+        <w:rPr>
+          <w:rFonts w:ascii="Times New Roman" w:cs="Times New Roman" w:eastAsia="Times New Roman" w:hAnsi="Times New Roman"/>
+          <w:b/>
+          <w:bCs/>
+          <w:color w:val="000000"/>
+          <w:sz w:val="30"/>
+          <w:szCs w:val="30"/>
+        </w:rPr>
+        <w:t xml:space="preserve">4.2. Tipografía y forma</w:t>
+      </w:r>
+    </w:p>
+    <w:p>
+      <w:pPr>
+        <w:spacing w:after="160" w:line="300"/>
+        <w:jc w:val="both"/>
+      </w:pPr>
+      <w:r>
+        <w:rPr>
+          <w:rFonts w:ascii="Times New Roman" w:cs="Times New Roman" w:eastAsia="Times New Roman" w:hAnsi="Times New Roman"/>
+          <w:sz w:val="24"/>
+          <w:szCs w:val="24"/>
+        </w:rPr>
+        <w:t xml:space="preserve">Se seleccionó la familia tipográfica Plus Jakarta Sans, de trazo geométrico y aspecto amable, con soporte completo de acentos y ñ. Se definió una escala de siete tamaños que abarca desde el titular principal hasta las etiquetas, con variantes propias para la vista móvil.</w:t>
+      </w:r>
+    </w:p>
+    <w:p>
+      <w:pPr>
+        <w:spacing w:after="160" w:line="300"/>
+        <w:jc w:val="both"/>
+      </w:pPr>
+      <w:r>
+        <w:rPr>
+          <w:rFonts w:ascii="Times New Roman" w:cs="Times New Roman" w:eastAsia="Times New Roman" w:hAnsi="Times New Roman"/>
+          <w:sz w:val="24"/>
+          <w:szCs w:val="24"/>
+        </w:rPr>
+        <w:t xml:space="preserve">En cuanto a la forma, se establecieron radios amplios para campos y tarjetas, botones y etiquetas de estado con radio completo, y sombras suaves teñidas del color del elemento en lugar de sombras grises. Estas decisiones buscan que la plataforma resulte cercana para el estudiantado y se distinga de la estética de un portal administrativo.</w:t>
+      </w:r>
+    </w:p>
+    <w:p>
+      <w:pPr>
+        <w:pStyle w:val="Heading2"/>
+        <w:spacing w:after="160" w:before="280"/>
+      </w:pPr>
+      <w:r>
+        <w:rPr>
+          <w:rFonts w:ascii="Times New Roman" w:cs="Times New Roman" w:eastAsia="Times New Roman" w:hAnsi="Times New Roman"/>
+          <w:b/>
+          <w:bCs/>
+          <w:color w:val="000000"/>
+          <w:sz w:val="30"/>
+          <w:szCs w:val="30"/>
+        </w:rPr>
+        <w:t xml:space="preserve">4.3. Prototipos de las pantallas principales</w:t>
+      </w:r>
+    </w:p>
+    <w:p>
+      <w:pPr>
+        <w:spacing w:after="160" w:line="300"/>
+        <w:jc w:val="both"/>
+      </w:pPr>
+      <w:r>
+        <w:rPr>
+          <w:rFonts w:ascii="Times New Roman" w:cs="Times New Roman" w:eastAsia="Times New Roman" w:hAnsi="Times New Roman"/>
+          <w:sz w:val="24"/>
+          <w:szCs w:val="24"/>
+        </w:rPr>
+        <w:t xml:space="preserve">Se elaboraron los prototipos de las pantallas principales de la plataforma, en sus versiones para computadora y para dispositivos móviles. Las pantallas cubiertas son la página principal, la página sobre AEUVG, la creación de cuenta, el inicio de sesión con sus flujos de recuperación y restablecimiento de contraseña, la confirmación de correo, el listado y el detalle de eventos, el perfil del estudiante en sus distintas pestañas, y el panel administrativo con su resumen y la gestión de horas beca.</w:t>
+      </w:r>
+    </w:p>
+    <w:p>
+      <w:pPr>
+        <w:spacing w:after="160" w:line="300"/>
+        <w:jc w:val="both"/>
+      </w:pPr>
+      <w:r>
+        <w:rPr>
+          <w:rFonts w:ascii="Times New Roman" w:cs="Times New Roman" w:eastAsia="Times New Roman" w:hAnsi="Times New Roman"/>
+          <w:sz w:val="24"/>
+          <w:szCs w:val="24"/>
+        </w:rPr>
+        <w:t xml:space="preserve">Los prototipos se revisaron contra el modelo de datos implementado en la historia anterior para asegurar que la información mostrada corresponda con la que el sistema efectivamente almacena. Los prototipos se conservan en el repositorio como referencia de estructura y espaciado para la implementación, entendiendo que son una guía y no una especificación cerrada.</w:t>
+      </w:r>
+    </w:p>
+    <w:p>
+      <w:pPr>
+        <w:pStyle w:val="Heading2"/>
+        <w:spacing w:after="160" w:before="280"/>
+      </w:pPr>
+      <w:r>
+        <w:rPr>
+          <w:rFonts w:ascii="Times New Roman" w:cs="Times New Roman" w:eastAsia="Times New Roman" w:hAnsi="Times New Roman"/>
+          <w:b/>
+          <w:bCs/>
+          <w:color w:val="000000"/>
+          <w:sz w:val="30"/>
+          <w:szCs w:val="30"/>
+        </w:rPr>
+        <w:t xml:space="preserve">4.4. Diseño adaptable</w:t>
+      </w:r>
+    </w:p>
+    <w:p>
+      <w:pPr>
+        <w:spacing w:after="160" w:line="300"/>
+        <w:jc w:val="both"/>
+      </w:pPr>
+      <w:r>
+        <w:rPr>
+          <w:rFonts w:ascii="Times New Roman" w:cs="Times New Roman" w:eastAsia="Times New Roman" w:hAnsi="Times New Roman"/>
+          <w:sz w:val="24"/>
+          <w:szCs w:val="24"/>
+        </w:rPr>
+        <w:t xml:space="preserve">Se adoptaron los puntos de corte estándar del sistema de estilos del proyecto, correspondientes a teléfono, tableta, escritorio y escritorio amplio, con un ancho máximo de contenido de 1280 píxeles. El diseño prioriza la vista móvil, considerando que la mayoría de los estudiantes accede desde el teléfono.</w:t>
+      </w:r>
+    </w:p>
+    <w:p>
+      <w:pPr>
+        <w:pStyle w:val="Heading1"/>
+        <w:spacing w:after="200" w:before="360"/>
+      </w:pPr>
+      <w:r>
+        <w:rPr>
+          <w:rFonts w:ascii="Times New Roman" w:cs="Times New Roman" w:eastAsia="Times New Roman" w:hAnsi="Times New Roman"/>
+          <w:b/>
+          <w:bCs/>
+          <w:color w:val="000000"/>
+          <w:sz w:val="34"/>
+          <w:szCs w:val="34"/>
+        </w:rPr>
+        <w:t xml:space="preserve">5. Estado del sprint</w:t>
+      </w:r>
+    </w:p>
+    <w:p>
+      <w:pPr>
+        <w:spacing w:after="160" w:line="300"/>
+        <w:jc w:val="both"/>
+      </w:pPr>
+      <w:r>
+        <w:rPr>
+          <w:rFonts w:ascii="Times New Roman" w:cs="Times New Roman" w:eastAsia="Times New Roman" w:hAnsi="Times New Roman"/>
+          <w:sz w:val="24"/>
+          <w:szCs w:val="24"/>
+        </w:rPr>
+        <w:t xml:space="preserve">Al momento de esta actualización, las historias de usuario HU-01 y HU-02 se encuentran completadas y la HU-03 se encuentra en curso. El sistema cuenta con:</w:t>
       </w:r>
     </w:p>
     <w:p>
@@ -2003,6 +2634,44 @@
     </w:p>
     <w:p>
       <w:pPr>
+        <w:pStyle w:val="ListParagraph"/>
+        <w:numPr>
+          <w:ilvl w:val="0"/>
+          <w:numId w:val="2"/>
+        </w:numPr>
+        <w:spacing w:after="100" w:line="300"/>
+        <w:jc w:val="both"/>
+      </w:pPr>
+      <w:r>
+        <w:rPr>
+          <w:rFonts w:ascii="Times New Roman" w:cs="Times New Roman" w:eastAsia="Times New Roman" w:hAnsi="Times New Roman"/>
+          <w:sz w:val="24"/>
+          <w:szCs w:val="24"/>
+        </w:rPr>
+        <w:t xml:space="preserve">El sistema de diseño definido y aplicado como variables dentro del proyecto.</w:t>
+      </w:r>
+    </w:p>
+    <w:p>
+      <w:pPr>
+        <w:pStyle w:val="ListParagraph"/>
+        <w:numPr>
+          <w:ilvl w:val="0"/>
+          <w:numId w:val="2"/>
+        </w:numPr>
+        <w:spacing w:after="100" w:line="300"/>
+        <w:jc w:val="both"/>
+      </w:pPr>
+      <w:r>
+        <w:rPr>
+          <w:rFonts w:ascii="Times New Roman" w:cs="Times New Roman" w:eastAsia="Times New Roman" w:hAnsi="Times New Roman"/>
+          <w:sz w:val="24"/>
+          <w:szCs w:val="24"/>
+        </w:rPr>
+        <w:t xml:space="preserve">Los prototipos de las pantallas principales elaborados para computadora y móvil.</w:t>
+      </w:r>
+    </w:p>
+    <w:p>
+      <w:pPr>
         <w:spacing w:after="160" w:line="300"/>
         <w:jc w:val="both"/>
       </w:pPr>
@@ -2012,7 +2681,7 @@
           <w:sz w:val="24"/>
           <w:szCs w:val="24"/>
         </w:rPr>
-        <w:t xml:space="preserve">El trámite del dominio institucional continúa en gestión ante la universidad. Las historias restantes del sprint corresponden al sistema de diseño y prototipos, la autenticación de usuarios, los roles y permisos, y las páginas informativas de AEUVG.</w:t>
+        <w:t xml:space="preserve">El trámite del dominio institucional continúa en gestión ante la universidad. De la HU-03 permanecen en curso la implementación de la biblioteca de componentes dentro del proyecto y la presentación de los prototipos a AEUVG. Las historias restantes del sprint corresponden a la autenticación de usuarios, los roles y permisos, y las páginas informativas de AEUVG.</w:t>
       </w:r>
     </w:p>
     <w:sectPr>

</xml_diff>

<commit_message>
Cerrar HU-03: componentes, capturas y validación con AEUVG
- Biblioteca de componentes base implementada sobre los tokens de la
  paleta: botones, campos, tarjetas, tablas, etiquetas de estado,
  alertas, encabezado y pie de página
- Página interna /diseno que reúne los componentes y sirve para
  verificar su comportamiento entre puntos de corte
- Capturas de las 23 pantallas regeneradas con la paleta definitiva
  y el logo oficial
- Documento del Sprint 1 con la historia completa e imágenes de las
  pantallas principales incrustadas
- Stack documentado con componentes propios en lugar de un kit externo
</commit_message>
<xml_diff>
--- a/Documentos/AEUVG - Desarrollo Sprint 1.docx
+++ b/Documentos/AEUVG - Desarrollo Sprint 1.docx
@@ -1884,7 +1884,7 @@
           <w:sz w:val="24"/>
           <w:szCs w:val="24"/>
         </w:rPr>
-        <w:t xml:space="preserve">Esta historia define la identidad visual de la plataforma y los prototipos de sus pantallas principales, de manera que el desarrollo de las interfaces sea consistente durante todo el proyecto y no deba rediseñarse en cada sprint. Al momento de esta actualización se encuentran definidos el sistema de diseño y los prototipos; la implementación de la biblioteca de componentes y la presentación a AEUVG continúan en curso.</w:t>
+        <w:t xml:space="preserve">Esta historia define la identidad visual de la plataforma, los prototipos de sus pantallas principales y la biblioteca de componentes con la que se construirán todas las interfaces. Su propósito es que el desarrollo sea consistente durante el resto del proyecto y que no deba rediseñarse en cada sprint.</w:t>
       </w:r>
     </w:p>
     <w:p>
@@ -1915,7 +1915,7 @@
           <w:sz w:val="24"/>
           <w:szCs w:val="24"/>
         </w:rPr>
-        <w:t xml:space="preserve">La paleta se derivó del logo de AEUVG, que representa figuras humanas de colores distintos formando un círculo, en alusión a la unión de las asociaciones estudiantiles. Dado que ningún color del logo predomina sobre los demás, se optó por tomar el violeta como color de acción, por ser el que mejor se identifica como elemento interactivo, y repartir los tonos restantes como acentos a lo largo de la interfaz.</w:t>
+        <w:t xml:space="preserve">La paleta se derivó del logo de AEUVG, que representa figuras humanas de colores distintos formando un círculo, en alusión a la unión de las asociaciones estudiantiles. Dado que ningún color del logo predomina sobre los demás, se tomó el violeta como color de acción, por ser el que mejor se identifica como elemento interactivo, y los tonos restantes se repartieron como acentos a lo largo de la interfaz.</w:t>
       </w:r>
     </w:p>
     <w:p>
@@ -2363,7 +2363,7 @@
           <w:sz w:val="24"/>
           <w:szCs w:val="24"/>
         </w:rPr>
-        <w:t xml:space="preserve">Cada una de las ocho categorías de eventos cargadas durante la historia anterior tiene asignado uno de los colores de acento, almacenado en la propia base de datos. La paleta completa quedó documentada en el archivo docs/diseno/sistema-diseno.md e implementada como variables de diseño dentro del proyecto, de modo que las pantallas la consumen desde un único lugar.</w:t>
+        <w:t xml:space="preserve">Cada una de las ocho categorías de eventos cargadas durante la historia anterior tiene asignado uno de los colores de acento, almacenado en la propia base de datos. La paleta completa quedó documentada en el repositorio e implementada como variables de diseño dentro del proyecto, de modo que todas las pantallas la consumen desde un único lugar.</w:t>
       </w:r>
     </w:p>
     <w:p>
@@ -2408,7 +2408,7 @@
           <w:sz w:val="24"/>
           <w:szCs w:val="24"/>
         </w:rPr>
-        <w:t xml:space="preserve">En cuanto a la forma, se establecieron radios amplios para campos y tarjetas, botones y etiquetas de estado con radio completo, y sombras suaves teñidas del color del elemento en lugar de sombras grises. Estas decisiones buscan que la plataforma resulte cercana para el estudiantado y se distinga de la estética de un portal administrativo.</w:t>
+        <w:t xml:space="preserve">En cuanto a la forma, se establecieron radios amplios para campos y tarjetas, botones y etiquetas de estado con radio completo, y sombras suaves teñidas del color del elemento en lugar de sombras grises neutras. Estas decisiones buscan que la plataforma resulte cercana para el estudiantado y se distinga de la estética de un portal administrativo.</w:t>
       </w:r>
     </w:p>
     <w:p>
@@ -2425,7 +2425,7 @@
           <w:sz w:val="30"/>
           <w:szCs w:val="30"/>
         </w:rPr>
-        <w:t xml:space="preserve">4.3. Prototipos de las pantallas principales</w:t>
+        <w:t xml:space="preserve">4.3. Biblioteca de componentes</w:t>
       </w:r>
     </w:p>
     <w:p>
@@ -2439,7 +2439,7 @@
           <w:sz w:val="24"/>
           <w:szCs w:val="24"/>
         </w:rPr>
-        <w:t xml:space="preserve">Se elaboraron los prototipos de las pantallas principales de la plataforma, en sus versiones para computadora y para dispositivos móviles. Las pantallas cubiertas son la página principal, la página sobre AEUVG, la creación de cuenta, el inicio de sesión con sus flujos de recuperación y restablecimiento de contraseña, la confirmación de correo, el listado y el detalle de eventos, el perfil del estudiante en sus distintas pestañas, y el panel administrativo con su resumen y la gestión de horas beca.</w:t>
+        <w:t xml:space="preserve">Se implementó dentro del proyecto la biblioteca de componentes base sobre la que se construirán todas las pantallas: botones en sus cinco variantes con sus estados, campos de formulario con etiqueta, texto de ayuda y estado de error, tarjetas, tablas de datos, etiquetas de estado, mensajes de alerta, encabezado de navegación y pie de página.</w:t>
       </w:r>
     </w:p>
     <w:p>
@@ -2453,7 +2453,69 @@
           <w:sz w:val="24"/>
           <w:szCs w:val="24"/>
         </w:rPr>
-        <w:t xml:space="preserve">Los prototipos se revisaron contra el modelo de datos implementado en la historia anterior para asegurar que la información mostrada corresponda con la que el sistema efectivamente almacena. Los prototipos se conservan en el repositorio como referencia de estructura y espaciado para la implementación, entendiendo que son una guía y no una especificación cerrada.</w:t>
+        <w:t xml:space="preserve">Los componentes consumen directamente las variables de la paleta, por lo que un ajuste de color se refleja en toda la plataforma sin modificar cada pantalla. Se incluyó además una página interna que reúne todos los componentes, la cual sirve como referencia visual para el equipo y permite verificar su comportamiento en distintos tamaños de pantalla.</w:t>
+      </w:r>
+    </w:p>
+    <w:p>
+      <w:pPr>
+        <w:spacing w:after="80" w:before="200"/>
+        <w:jc w:val="center"/>
+      </w:pPr>
+      <w:r>
+        <w:drawing>
+          <wp:inline distT="0" distB="0" distL="0" distR="0">
+            <wp:extent cx="5905500" cy="6858000"/>
+            <wp:effectExtent t="0" r="0" b="0" l="0"/>
+            <wp:docPr id="1" name="" descr="" title=""/>
+            <wp:cNvGraphicFramePr>
+              <a:graphicFrameLocks xmlns:a="http://schemas.openxmlformats.org/drawingml/2006/main" noChangeAspect="1"/>
+            </wp:cNvGraphicFramePr>
+            <a:graphic xmlns:a="http://schemas.openxmlformats.org/drawingml/2006/main">
+              <a:graphicData uri="http://schemas.openxmlformats.org/drawingml/2006/picture">
+                <pic:pic xmlns:pic="http://schemas.openxmlformats.org/drawingml/2006/picture">
+                  <pic:nvPicPr>
+                    <pic:cNvPr id="0" name="" descr=""/>
+                    <pic:cNvPicPr>
+                      <a:picLocks noChangeAspect="1" noChangeArrowheads="1"/>
+                    </pic:cNvPicPr>
+                  </pic:nvPicPr>
+                  <pic:blipFill>
+                    <a:blip r:embed="rId7" cstate="none"/>
+                    <a:srcRect/>
+                    <a:stretch>
+                      <a:fillRect/>
+                    </a:stretch>
+                  </pic:blipFill>
+                  <pic:spPr bwMode="auto">
+                    <a:xfrm>
+                      <a:off x="0" y="0"/>
+                      <a:ext cx="5905500" cy="6858000"/>
+                    </a:xfrm>
+                    <a:prstGeom prst="rect">
+                      <a:avLst/>
+                    </a:prstGeom>
+                  </pic:spPr>
+                </pic:pic>
+              </a:graphicData>
+            </a:graphic>
+          </wp:inline>
+        </w:drawing>
+      </w:r>
+    </w:p>
+    <w:p>
+      <w:pPr>
+        <w:spacing w:after="240"/>
+        <w:jc w:val="center"/>
+      </w:pPr>
+      <w:r>
+        <w:rPr>
+          <w:rFonts w:ascii="Times New Roman" w:cs="Times New Roman" w:eastAsia="Times New Roman" w:hAnsi="Times New Roman"/>
+          <w:i/>
+          <w:iCs/>
+          <w:sz w:val="20"/>
+          <w:szCs w:val="20"/>
+        </w:rPr>
+        <w:t xml:space="preserve">Biblioteca de componentes base implementada en el proyecto.</w:t>
       </w:r>
     </w:p>
     <w:p>
@@ -2470,7 +2532,7 @@
           <w:sz w:val="30"/>
           <w:szCs w:val="30"/>
         </w:rPr>
-        <w:t xml:space="preserve">4.4. Diseño adaptable</w:t>
+        <w:t xml:space="preserve">4.4. Prototipos de las pantallas principales</w:t>
       </w:r>
     </w:p>
     <w:p>
@@ -2484,7 +2546,641 @@
           <w:sz w:val="24"/>
           <w:szCs w:val="24"/>
         </w:rPr>
+        <w:t xml:space="preserve">Se elaboraron los prototipos de las pantallas principales de la plataforma, en sus versiones para computadora y para dispositivos móviles. Las pantallas cubiertas son la página principal, la página sobre AEUVG, la creación de cuenta, el inicio de sesión con sus flujos de recuperación y restablecimiento de contraseña, la confirmación de correo, el listado y el detalle de eventos, el perfil del estudiante en sus distintas pestañas, y el panel administrativo con su resumen y la gestión de horas beca.</w:t>
+      </w:r>
+    </w:p>
+    <w:p>
+      <w:pPr>
+        <w:spacing w:after="160" w:line="300"/>
+        <w:jc w:val="both"/>
+      </w:pPr>
+      <w:r>
+        <w:rPr>
+          <w:rFonts w:ascii="Times New Roman" w:cs="Times New Roman" w:eastAsia="Times New Roman" w:hAnsi="Times New Roman"/>
+          <w:sz w:val="24"/>
+          <w:szCs w:val="24"/>
+        </w:rPr>
+        <w:t xml:space="preserve">Los prototipos se revisaron contra el modelo de datos implementado en la historia anterior, de modo que la información mostrada corresponda con la que el sistema efectivamente almacena. A continuación se presentan las pantallas más representativas.</w:t>
+      </w:r>
+    </w:p>
+    <w:p>
+      <w:pPr>
+        <w:spacing w:after="80" w:before="200"/>
+        <w:jc w:val="center"/>
+      </w:pPr>
+      <w:r>
+        <w:drawing>
+          <wp:inline distT="0" distB="0" distL="0" distR="0">
+            <wp:extent cx="5905500" cy="6858000"/>
+            <wp:effectExtent t="0" r="0" b="0" l="0"/>
+            <wp:docPr id="1" name="" descr="" title=""/>
+            <wp:cNvGraphicFramePr>
+              <a:graphicFrameLocks xmlns:a="http://schemas.openxmlformats.org/drawingml/2006/main" noChangeAspect="1"/>
+            </wp:cNvGraphicFramePr>
+            <a:graphic xmlns:a="http://schemas.openxmlformats.org/drawingml/2006/main">
+              <a:graphicData uri="http://schemas.openxmlformats.org/drawingml/2006/picture">
+                <pic:pic xmlns:pic="http://schemas.openxmlformats.org/drawingml/2006/picture">
+                  <pic:nvPicPr>
+                    <pic:cNvPr id="0" name="" descr=""/>
+                    <pic:cNvPicPr>
+                      <a:picLocks noChangeAspect="1" noChangeArrowheads="1"/>
+                    </pic:cNvPicPr>
+                  </pic:nvPicPr>
+                  <pic:blipFill>
+                    <a:blip r:embed="rId8" cstate="none"/>
+                    <a:srcRect/>
+                    <a:stretch>
+                      <a:fillRect/>
+                    </a:stretch>
+                  </pic:blipFill>
+                  <pic:spPr bwMode="auto">
+                    <a:xfrm>
+                      <a:off x="0" y="0"/>
+                      <a:ext cx="5905500" cy="6858000"/>
+                    </a:xfrm>
+                    <a:prstGeom prst="rect">
+                      <a:avLst/>
+                    </a:prstGeom>
+                  </pic:spPr>
+                </pic:pic>
+              </a:graphicData>
+            </a:graphic>
+          </wp:inline>
+        </w:drawing>
+      </w:r>
+    </w:p>
+    <w:p>
+      <w:pPr>
+        <w:spacing w:after="240"/>
+        <w:jc w:val="center"/>
+      </w:pPr>
+      <w:r>
+        <w:rPr>
+          <w:rFonts w:ascii="Times New Roman" w:cs="Times New Roman" w:eastAsia="Times New Roman" w:hAnsi="Times New Roman"/>
+          <w:i/>
+          <w:iCs/>
+          <w:sz w:val="20"/>
+          <w:szCs w:val="20"/>
+        </w:rPr>
+        <w:t xml:space="preserve">Página principal.</w:t>
+      </w:r>
+    </w:p>
+    <w:p>
+      <w:pPr>
+        <w:spacing w:after="80" w:before="200"/>
+        <w:jc w:val="center"/>
+      </w:pPr>
+      <w:r>
+        <w:drawing>
+          <wp:inline distT="0" distB="0" distL="0" distR="0">
+            <wp:extent cx="5905500" cy="6858000"/>
+            <wp:effectExtent t="0" r="0" b="0" l="0"/>
+            <wp:docPr id="1" name="" descr="" title=""/>
+            <wp:cNvGraphicFramePr>
+              <a:graphicFrameLocks xmlns:a="http://schemas.openxmlformats.org/drawingml/2006/main" noChangeAspect="1"/>
+            </wp:cNvGraphicFramePr>
+            <a:graphic xmlns:a="http://schemas.openxmlformats.org/drawingml/2006/main">
+              <a:graphicData uri="http://schemas.openxmlformats.org/drawingml/2006/picture">
+                <pic:pic xmlns:pic="http://schemas.openxmlformats.org/drawingml/2006/picture">
+                  <pic:nvPicPr>
+                    <pic:cNvPr id="0" name="" descr=""/>
+                    <pic:cNvPicPr>
+                      <a:picLocks noChangeAspect="1" noChangeArrowheads="1"/>
+                    </pic:cNvPicPr>
+                  </pic:nvPicPr>
+                  <pic:blipFill>
+                    <a:blip r:embed="rId9" cstate="none"/>
+                    <a:srcRect/>
+                    <a:stretch>
+                      <a:fillRect/>
+                    </a:stretch>
+                  </pic:blipFill>
+                  <pic:spPr bwMode="auto">
+                    <a:xfrm>
+                      <a:off x="0" y="0"/>
+                      <a:ext cx="5905500" cy="6858000"/>
+                    </a:xfrm>
+                    <a:prstGeom prst="rect">
+                      <a:avLst/>
+                    </a:prstGeom>
+                  </pic:spPr>
+                </pic:pic>
+              </a:graphicData>
+            </a:graphic>
+          </wp:inline>
+        </w:drawing>
+      </w:r>
+    </w:p>
+    <w:p>
+      <w:pPr>
+        <w:spacing w:after="240"/>
+        <w:jc w:val="center"/>
+      </w:pPr>
+      <w:r>
+        <w:rPr>
+          <w:rFonts w:ascii="Times New Roman" w:cs="Times New Roman" w:eastAsia="Times New Roman" w:hAnsi="Times New Roman"/>
+          <w:i/>
+          <w:iCs/>
+          <w:sz w:val="20"/>
+          <w:szCs w:val="20"/>
+        </w:rPr>
+        <w:t xml:space="preserve">Listado de eventos con sus filtros.</w:t>
+      </w:r>
+    </w:p>
+    <w:p>
+      <w:pPr>
+        <w:spacing w:after="80" w:before="200"/>
+        <w:jc w:val="center"/>
+      </w:pPr>
+      <w:r>
+        <w:drawing>
+          <wp:inline distT="0" distB="0" distL="0" distR="0">
+            <wp:extent cx="5905500" cy="6858000"/>
+            <wp:effectExtent t="0" r="0" b="0" l="0"/>
+            <wp:docPr id="1" name="" descr="" title=""/>
+            <wp:cNvGraphicFramePr>
+              <a:graphicFrameLocks xmlns:a="http://schemas.openxmlformats.org/drawingml/2006/main" noChangeAspect="1"/>
+            </wp:cNvGraphicFramePr>
+            <a:graphic xmlns:a="http://schemas.openxmlformats.org/drawingml/2006/main">
+              <a:graphicData uri="http://schemas.openxmlformats.org/drawingml/2006/picture">
+                <pic:pic xmlns:pic="http://schemas.openxmlformats.org/drawingml/2006/picture">
+                  <pic:nvPicPr>
+                    <pic:cNvPr id="0" name="" descr=""/>
+                    <pic:cNvPicPr>
+                      <a:picLocks noChangeAspect="1" noChangeArrowheads="1"/>
+                    </pic:cNvPicPr>
+                  </pic:nvPicPr>
+                  <pic:blipFill>
+                    <a:blip r:embed="rId10" cstate="none"/>
+                    <a:srcRect/>
+                    <a:stretch>
+                      <a:fillRect/>
+                    </a:stretch>
+                  </pic:blipFill>
+                  <pic:spPr bwMode="auto">
+                    <a:xfrm>
+                      <a:off x="0" y="0"/>
+                      <a:ext cx="5905500" cy="6858000"/>
+                    </a:xfrm>
+                    <a:prstGeom prst="rect">
+                      <a:avLst/>
+                    </a:prstGeom>
+                  </pic:spPr>
+                </pic:pic>
+              </a:graphicData>
+            </a:graphic>
+          </wp:inline>
+        </w:drawing>
+      </w:r>
+    </w:p>
+    <w:p>
+      <w:pPr>
+        <w:spacing w:after="240"/>
+        <w:jc w:val="center"/>
+      </w:pPr>
+      <w:r>
+        <w:rPr>
+          <w:rFonts w:ascii="Times New Roman" w:cs="Times New Roman" w:eastAsia="Times New Roman" w:hAnsi="Times New Roman"/>
+          <w:i/>
+          <w:iCs/>
+          <w:sz w:val="20"/>
+          <w:szCs w:val="20"/>
+        </w:rPr>
+        <w:t xml:space="preserve">Página informativa sobre AEUVG.</w:t>
+      </w:r>
+    </w:p>
+    <w:p>
+      <w:pPr>
+        <w:spacing w:after="80" w:before="200"/>
+        <w:jc w:val="center"/>
+      </w:pPr>
+      <w:r>
+        <w:drawing>
+          <wp:inline distT="0" distB="0" distL="0" distR="0">
+            <wp:extent cx="5905500" cy="6858000"/>
+            <wp:effectExtent t="0" r="0" b="0" l="0"/>
+            <wp:docPr id="1" name="" descr="" title=""/>
+            <wp:cNvGraphicFramePr>
+              <a:graphicFrameLocks xmlns:a="http://schemas.openxmlformats.org/drawingml/2006/main" noChangeAspect="1"/>
+            </wp:cNvGraphicFramePr>
+            <a:graphic xmlns:a="http://schemas.openxmlformats.org/drawingml/2006/main">
+              <a:graphicData uri="http://schemas.openxmlformats.org/drawingml/2006/picture">
+                <pic:pic xmlns:pic="http://schemas.openxmlformats.org/drawingml/2006/picture">
+                  <pic:nvPicPr>
+                    <pic:cNvPr id="0" name="" descr=""/>
+                    <pic:cNvPicPr>
+                      <a:picLocks noChangeAspect="1" noChangeArrowheads="1"/>
+                    </pic:cNvPicPr>
+                  </pic:nvPicPr>
+                  <pic:blipFill>
+                    <a:blip r:embed="rId11" cstate="none"/>
+                    <a:srcRect/>
+                    <a:stretch>
+                      <a:fillRect/>
+                    </a:stretch>
+                  </pic:blipFill>
+                  <pic:spPr bwMode="auto">
+                    <a:xfrm>
+                      <a:off x="0" y="0"/>
+                      <a:ext cx="5905500" cy="6858000"/>
+                    </a:xfrm>
+                    <a:prstGeom prst="rect">
+                      <a:avLst/>
+                    </a:prstGeom>
+                  </pic:spPr>
+                </pic:pic>
+              </a:graphicData>
+            </a:graphic>
+          </wp:inline>
+        </w:drawing>
+      </w:r>
+    </w:p>
+    <w:p>
+      <w:pPr>
+        <w:spacing w:after="240"/>
+        <w:jc w:val="center"/>
+      </w:pPr>
+      <w:r>
+        <w:rPr>
+          <w:rFonts w:ascii="Times New Roman" w:cs="Times New Roman" w:eastAsia="Times New Roman" w:hAnsi="Times New Roman"/>
+          <w:i/>
+          <w:iCs/>
+          <w:sz w:val="20"/>
+          <w:szCs w:val="20"/>
+        </w:rPr>
+        <w:t xml:space="preserve">Creación de cuenta.</w:t>
+      </w:r>
+    </w:p>
+    <w:p>
+      <w:pPr>
+        <w:spacing w:after="80" w:before="200"/>
+        <w:jc w:val="center"/>
+      </w:pPr>
+      <w:r>
+        <w:drawing>
+          <wp:inline distT="0" distB="0" distL="0" distR="0">
+            <wp:extent cx="5905500" cy="6858000"/>
+            <wp:effectExtent t="0" r="0" b="0" l="0"/>
+            <wp:docPr id="1" name="" descr="" title=""/>
+            <wp:cNvGraphicFramePr>
+              <a:graphicFrameLocks xmlns:a="http://schemas.openxmlformats.org/drawingml/2006/main" noChangeAspect="1"/>
+            </wp:cNvGraphicFramePr>
+            <a:graphic xmlns:a="http://schemas.openxmlformats.org/drawingml/2006/main">
+              <a:graphicData uri="http://schemas.openxmlformats.org/drawingml/2006/picture">
+                <pic:pic xmlns:pic="http://schemas.openxmlformats.org/drawingml/2006/picture">
+                  <pic:nvPicPr>
+                    <pic:cNvPr id="0" name="" descr=""/>
+                    <pic:cNvPicPr>
+                      <a:picLocks noChangeAspect="1" noChangeArrowheads="1"/>
+                    </pic:cNvPicPr>
+                  </pic:nvPicPr>
+                  <pic:blipFill>
+                    <a:blip r:embed="rId12" cstate="none"/>
+                    <a:srcRect/>
+                    <a:stretch>
+                      <a:fillRect/>
+                    </a:stretch>
+                  </pic:blipFill>
+                  <pic:spPr bwMode="auto">
+                    <a:xfrm>
+                      <a:off x="0" y="0"/>
+                      <a:ext cx="5905500" cy="6858000"/>
+                    </a:xfrm>
+                    <a:prstGeom prst="rect">
+                      <a:avLst/>
+                    </a:prstGeom>
+                  </pic:spPr>
+                </pic:pic>
+              </a:graphicData>
+            </a:graphic>
+          </wp:inline>
+        </w:drawing>
+      </w:r>
+    </w:p>
+    <w:p>
+      <w:pPr>
+        <w:spacing w:after="240"/>
+        <w:jc w:val="center"/>
+      </w:pPr>
+      <w:r>
+        <w:rPr>
+          <w:rFonts w:ascii="Times New Roman" w:cs="Times New Roman" w:eastAsia="Times New Roman" w:hAnsi="Times New Roman"/>
+          <w:i/>
+          <w:iCs/>
+          <w:sz w:val="20"/>
+          <w:szCs w:val="20"/>
+        </w:rPr>
+        <w:t xml:space="preserve">Perfil del estudiante con el resumen de sus horas beca.</w:t>
+      </w:r>
+    </w:p>
+    <w:p>
+      <w:pPr>
+        <w:spacing w:after="80" w:before="200"/>
+        <w:jc w:val="center"/>
+      </w:pPr>
+      <w:r>
+        <w:drawing>
+          <wp:inline distT="0" distB="0" distL="0" distR="0">
+            <wp:extent cx="5905500" cy="5534025"/>
+            <wp:effectExtent t="0" r="0" b="0" l="0"/>
+            <wp:docPr id="1" name="" descr="" title=""/>
+            <wp:cNvGraphicFramePr>
+              <a:graphicFrameLocks xmlns:a="http://schemas.openxmlformats.org/drawingml/2006/main" noChangeAspect="1"/>
+            </wp:cNvGraphicFramePr>
+            <a:graphic xmlns:a="http://schemas.openxmlformats.org/drawingml/2006/main">
+              <a:graphicData uri="http://schemas.openxmlformats.org/drawingml/2006/picture">
+                <pic:pic xmlns:pic="http://schemas.openxmlformats.org/drawingml/2006/picture">
+                  <pic:nvPicPr>
+                    <pic:cNvPr id="0" name="" descr=""/>
+                    <pic:cNvPicPr>
+                      <a:picLocks noChangeAspect="1" noChangeArrowheads="1"/>
+                    </pic:cNvPicPr>
+                  </pic:nvPicPr>
+                  <pic:blipFill>
+                    <a:blip r:embed="rId13" cstate="none"/>
+                    <a:srcRect/>
+                    <a:stretch>
+                      <a:fillRect/>
+                    </a:stretch>
+                  </pic:blipFill>
+                  <pic:spPr bwMode="auto">
+                    <a:xfrm>
+                      <a:off x="0" y="0"/>
+                      <a:ext cx="5905500" cy="5534025"/>
+                    </a:xfrm>
+                    <a:prstGeom prst="rect">
+                      <a:avLst/>
+                    </a:prstGeom>
+                  </pic:spPr>
+                </pic:pic>
+              </a:graphicData>
+            </a:graphic>
+          </wp:inline>
+        </w:drawing>
+      </w:r>
+    </w:p>
+    <w:p>
+      <w:pPr>
+        <w:spacing w:after="240"/>
+        <w:jc w:val="center"/>
+      </w:pPr>
+      <w:r>
+        <w:rPr>
+          <w:rFonts w:ascii="Times New Roman" w:cs="Times New Roman" w:eastAsia="Times New Roman" w:hAnsi="Times New Roman"/>
+          <w:i/>
+          <w:iCs/>
+          <w:sz w:val="20"/>
+          <w:szCs w:val="20"/>
+        </w:rPr>
+        <w:t xml:space="preserve">Panel administrativo: resumen general.</w:t>
+      </w:r>
+    </w:p>
+    <w:p>
+      <w:pPr>
+        <w:spacing w:after="80" w:before="200"/>
+        <w:jc w:val="center"/>
+      </w:pPr>
+      <w:r>
+        <w:drawing>
+          <wp:inline distT="0" distB="0" distL="0" distR="0">
+            <wp:extent cx="5905500" cy="5534025"/>
+            <wp:effectExtent t="0" r="0" b="0" l="0"/>
+            <wp:docPr id="1" name="" descr="" title=""/>
+            <wp:cNvGraphicFramePr>
+              <a:graphicFrameLocks xmlns:a="http://schemas.openxmlformats.org/drawingml/2006/main" noChangeAspect="1"/>
+            </wp:cNvGraphicFramePr>
+            <a:graphic xmlns:a="http://schemas.openxmlformats.org/drawingml/2006/main">
+              <a:graphicData uri="http://schemas.openxmlformats.org/drawingml/2006/picture">
+                <pic:pic xmlns:pic="http://schemas.openxmlformats.org/drawingml/2006/picture">
+                  <pic:nvPicPr>
+                    <pic:cNvPr id="0" name="" descr=""/>
+                    <pic:cNvPicPr>
+                      <a:picLocks noChangeAspect="1" noChangeArrowheads="1"/>
+                    </pic:cNvPicPr>
+                  </pic:nvPicPr>
+                  <pic:blipFill>
+                    <a:blip r:embed="rId14" cstate="none"/>
+                    <a:srcRect/>
+                    <a:stretch>
+                      <a:fillRect/>
+                    </a:stretch>
+                  </pic:blipFill>
+                  <pic:spPr bwMode="auto">
+                    <a:xfrm>
+                      <a:off x="0" y="0"/>
+                      <a:ext cx="5905500" cy="5534025"/>
+                    </a:xfrm>
+                    <a:prstGeom prst="rect">
+                      <a:avLst/>
+                    </a:prstGeom>
+                  </pic:spPr>
+                </pic:pic>
+              </a:graphicData>
+            </a:graphic>
+          </wp:inline>
+        </w:drawing>
+      </w:r>
+    </w:p>
+    <w:p>
+      <w:pPr>
+        <w:spacing w:after="240"/>
+        <w:jc w:val="center"/>
+      </w:pPr>
+      <w:r>
+        <w:rPr>
+          <w:rFonts w:ascii="Times New Roman" w:cs="Times New Roman" w:eastAsia="Times New Roman" w:hAnsi="Times New Roman"/>
+          <w:i/>
+          <w:iCs/>
+          <w:sz w:val="20"/>
+          <w:szCs w:val="20"/>
+        </w:rPr>
+        <w:t xml:space="preserve">Panel administrativo: gestión de horas beca.</w:t>
+      </w:r>
+    </w:p>
+    <w:p>
+      <w:pPr>
+        <w:pStyle w:val="Heading2"/>
+        <w:spacing w:after="160" w:before="280"/>
+      </w:pPr>
+      <w:r>
+        <w:rPr>
+          <w:rFonts w:ascii="Times New Roman" w:cs="Times New Roman" w:eastAsia="Times New Roman" w:hAnsi="Times New Roman"/>
+          <w:b/>
+          <w:bCs/>
+          <w:color w:val="000000"/>
+          <w:sz w:val="30"/>
+          <w:szCs w:val="30"/>
+        </w:rPr>
+        <w:t xml:space="preserve">4.5. Diseño adaptable</w:t>
+      </w:r>
+    </w:p>
+    <w:p>
+      <w:pPr>
+        <w:spacing w:after="160" w:line="300"/>
+        <w:jc w:val="both"/>
+      </w:pPr>
+      <w:r>
+        <w:rPr>
+          <w:rFonts w:ascii="Times New Roman" w:cs="Times New Roman" w:eastAsia="Times New Roman" w:hAnsi="Times New Roman"/>
+          <w:sz w:val="24"/>
+          <w:szCs w:val="24"/>
+        </w:rPr>
         <w:t xml:space="preserve">Se adoptaron los puntos de corte estándar del sistema de estilos del proyecto, correspondientes a teléfono, tableta, escritorio y escritorio amplio, con un ancho máximo de contenido de 1280 píxeles. El diseño prioriza la vista móvil, considerando que la mayoría de los estudiantes accede desde el teléfono.</w:t>
+      </w:r>
+    </w:p>
+    <w:p>
+      <w:pPr>
+        <w:spacing w:after="80" w:before="200"/>
+        <w:jc w:val="center"/>
+      </w:pPr>
+      <w:r>
+        <w:drawing>
+          <wp:inline distT="0" distB="0" distL="0" distR="0">
+            <wp:extent cx="2381250" cy="5905500"/>
+            <wp:effectExtent t="0" r="0" b="0" l="0"/>
+            <wp:docPr id="1" name="" descr="" title=""/>
+            <wp:cNvGraphicFramePr>
+              <a:graphicFrameLocks xmlns:a="http://schemas.openxmlformats.org/drawingml/2006/main" noChangeAspect="1"/>
+            </wp:cNvGraphicFramePr>
+            <a:graphic xmlns:a="http://schemas.openxmlformats.org/drawingml/2006/main">
+              <a:graphicData uri="http://schemas.openxmlformats.org/drawingml/2006/picture">
+                <pic:pic xmlns:pic="http://schemas.openxmlformats.org/drawingml/2006/picture">
+                  <pic:nvPicPr>
+                    <pic:cNvPr id="0" name="" descr=""/>
+                    <pic:cNvPicPr>
+                      <a:picLocks noChangeAspect="1" noChangeArrowheads="1"/>
+                    </pic:cNvPicPr>
+                  </pic:nvPicPr>
+                  <pic:blipFill>
+                    <a:blip r:embed="rId15" cstate="none"/>
+                    <a:srcRect/>
+                    <a:stretch>
+                      <a:fillRect/>
+                    </a:stretch>
+                  </pic:blipFill>
+                  <pic:spPr bwMode="auto">
+                    <a:xfrm>
+                      <a:off x="0" y="0"/>
+                      <a:ext cx="2381250" cy="5905500"/>
+                    </a:xfrm>
+                    <a:prstGeom prst="rect">
+                      <a:avLst/>
+                    </a:prstGeom>
+                  </pic:spPr>
+                </pic:pic>
+              </a:graphicData>
+            </a:graphic>
+          </wp:inline>
+        </w:drawing>
+      </w:r>
+    </w:p>
+    <w:p>
+      <w:pPr>
+        <w:spacing w:after="240"/>
+        <w:jc w:val="center"/>
+      </w:pPr>
+      <w:r>
+        <w:rPr>
+          <w:rFonts w:ascii="Times New Roman" w:cs="Times New Roman" w:eastAsia="Times New Roman" w:hAnsi="Times New Roman"/>
+          <w:i/>
+          <w:iCs/>
+          <w:sz w:val="20"/>
+          <w:szCs w:val="20"/>
+        </w:rPr>
+        <w:t xml:space="preserve">Página principal en su versión para dispositivos móviles.</w:t>
+      </w:r>
+    </w:p>
+    <w:p>
+      <w:pPr>
+        <w:spacing w:after="80" w:before="200"/>
+        <w:jc w:val="center"/>
+      </w:pPr>
+      <w:r>
+        <w:drawing>
+          <wp:inline distT="0" distB="0" distL="0" distR="0">
+            <wp:extent cx="2381250" cy="5905500"/>
+            <wp:effectExtent t="0" r="0" b="0" l="0"/>
+            <wp:docPr id="1" name="" descr="" title=""/>
+            <wp:cNvGraphicFramePr>
+              <a:graphicFrameLocks xmlns:a="http://schemas.openxmlformats.org/drawingml/2006/main" noChangeAspect="1"/>
+            </wp:cNvGraphicFramePr>
+            <a:graphic xmlns:a="http://schemas.openxmlformats.org/drawingml/2006/main">
+              <a:graphicData uri="http://schemas.openxmlformats.org/drawingml/2006/picture">
+                <pic:pic xmlns:pic="http://schemas.openxmlformats.org/drawingml/2006/picture">
+                  <pic:nvPicPr>
+                    <pic:cNvPr id="0" name="" descr=""/>
+                    <pic:cNvPicPr>
+                      <a:picLocks noChangeAspect="1" noChangeArrowheads="1"/>
+                    </pic:cNvPicPr>
+                  </pic:nvPicPr>
+                  <pic:blipFill>
+                    <a:blip r:embed="rId16" cstate="none"/>
+                    <a:srcRect/>
+                    <a:stretch>
+                      <a:fillRect/>
+                    </a:stretch>
+                  </pic:blipFill>
+                  <pic:spPr bwMode="auto">
+                    <a:xfrm>
+                      <a:off x="0" y="0"/>
+                      <a:ext cx="2381250" cy="5905500"/>
+                    </a:xfrm>
+                    <a:prstGeom prst="rect">
+                      <a:avLst/>
+                    </a:prstGeom>
+                  </pic:spPr>
+                </pic:pic>
+              </a:graphicData>
+            </a:graphic>
+          </wp:inline>
+        </w:drawing>
+      </w:r>
+    </w:p>
+    <w:p>
+      <w:pPr>
+        <w:spacing w:after="240"/>
+        <w:jc w:val="center"/>
+      </w:pPr>
+      <w:r>
+        <w:rPr>
+          <w:rFonts w:ascii="Times New Roman" w:cs="Times New Roman" w:eastAsia="Times New Roman" w:hAnsi="Times New Roman"/>
+          <w:i/>
+          <w:iCs/>
+          <w:sz w:val="20"/>
+          <w:szCs w:val="20"/>
+        </w:rPr>
+        <w:t xml:space="preserve">Perfil del estudiante en su versión para dispositivos móviles.</w:t>
+      </w:r>
+    </w:p>
+    <w:p>
+      <w:pPr>
+        <w:pStyle w:val="Heading2"/>
+        <w:spacing w:after="160" w:before="280"/>
+      </w:pPr>
+      <w:r>
+        <w:rPr>
+          <w:rFonts w:ascii="Times New Roman" w:cs="Times New Roman" w:eastAsia="Times New Roman" w:hAnsi="Times New Roman"/>
+          <w:b/>
+          <w:bCs/>
+          <w:color w:val="000000"/>
+          <w:sz w:val="30"/>
+          <w:szCs w:val="30"/>
+        </w:rPr>
+        <w:t xml:space="preserve">4.6. Validación con AEUVG</w:t>
+      </w:r>
+    </w:p>
+    <w:p>
+      <w:pPr>
+        <w:spacing w:after="160" w:line="300"/>
+        <w:jc w:val="both"/>
+      </w:pPr>
+      <w:r>
+        <w:rPr>
+          <w:rFonts w:ascii="Times New Roman" w:cs="Times New Roman" w:eastAsia="Times New Roman" w:hAnsi="Times New Roman"/>
+          <w:sz w:val="24"/>
+          <w:szCs w:val="24"/>
+        </w:rPr>
+        <w:t xml:space="preserve">Los prototipos y el sistema de diseño fueron presentados a AEUVG para su revisión. La asociación dio su aprobación sin solicitar cambios, por lo que la identidad visual y la estructura de las pantallas quedan confirmadas como base para el desarrollo de los módulos funcionales en los sprints siguientes.</w:t>
       </w:r>
     </w:p>
     <w:p>
@@ -2515,7 +3211,7 @@
           <w:sz w:val="24"/>
           <w:szCs w:val="24"/>
         </w:rPr>
-        <w:t xml:space="preserve">Al momento de esta actualización, las historias de usuario HU-01 y HU-02 se encuentran completadas y la HU-03 se encuentra en curso. El sistema cuenta con:</w:t>
+        <w:t xml:space="preserve">Al momento de esta actualización, las historias de usuario HU-01, HU-02 y HU-03 se encuentran completadas. El sistema cuenta con:</w:t>
       </w:r>
     </w:p>
     <w:p>
@@ -2667,7 +3363,26 @@
           <w:sz w:val="24"/>
           <w:szCs w:val="24"/>
         </w:rPr>
-        <w:t xml:space="preserve">Los prototipos de las pantallas principales elaborados para computadora y móvil.</w:t>
+        <w:t xml:space="preserve">La biblioteca de componentes base implementada.</w:t>
+      </w:r>
+    </w:p>
+    <w:p>
+      <w:pPr>
+        <w:pStyle w:val="ListParagraph"/>
+        <w:numPr>
+          <w:ilvl w:val="0"/>
+          <w:numId w:val="2"/>
+        </w:numPr>
+        <w:spacing w:after="100" w:line="300"/>
+        <w:jc w:val="both"/>
+      </w:pPr>
+      <w:r>
+        <w:rPr>
+          <w:rFonts w:ascii="Times New Roman" w:cs="Times New Roman" w:eastAsia="Times New Roman" w:hAnsi="Times New Roman"/>
+          <w:sz w:val="24"/>
+          <w:szCs w:val="24"/>
+        </w:rPr>
+        <w:t xml:space="preserve">Los prototipos de las pantallas principales elaborados para computadora y móvil, y aprobados por AEUVG.</w:t>
       </w:r>
     </w:p>
     <w:p>
@@ -2681,7 +3396,7 @@
           <w:sz w:val="24"/>
           <w:szCs w:val="24"/>
         </w:rPr>
-        <w:t xml:space="preserve">El trámite del dominio institucional continúa en gestión ante la universidad. De la HU-03 permanecen en curso la implementación de la biblioteca de componentes dentro del proyecto y la presentación de los prototipos a AEUVG. Las historias restantes del sprint corresponden a la autenticación de usuarios, los roles y permisos, y las páginas informativas de AEUVG.</w:t>
+        <w:t xml:space="preserve">El trámite del dominio institucional continúa en gestión ante la universidad. Las historias restantes del sprint corresponden a la autenticación de usuarios, los roles y permisos, y las páginas informativas de AEUVG.</w:t>
       </w:r>
     </w:p>
     <w:sectPr>

</xml_diff>